<commit_message>
despleigue con bloqueos de cobro
</commit_message>
<xml_diff>
--- a/backend/templates/FORMATO CERTIFICADO DEL SUPERVISOR.docx
+++ b/backend/templates/FORMATO CERTIFICADO DEL SUPERVISOR.docx
@@ -666,7 +666,17 @@
                 <w:sz w:val="18"/>
                 <w:szCs w:val="18"/>
               </w:rPr>
-              <w:t>CDP:</w:t>
+              <w:t>CDP</w:t>
+            </w:r>
+            <w:proofErr w:type="gramStart"/>
+            <w:r>
+              <w:rPr>
+                <w:rFonts w:ascii="Arial" w:hAnsi="Arial" w:cs="Arial"/>
+                <w:b/>
+                <w:sz w:val="18"/>
+                <w:szCs w:val="18"/>
+              </w:rPr>
+              <w:t>:</w:t>
             </w:r>
             <w:r>
               <w:rPr>
@@ -685,7 +695,7 @@
                 <w:sz w:val="18"/>
                 <w:szCs w:val="18"/>
               </w:rPr>
-              <w:t xml:space="preserve"> {{cdp}}</w:t>
+              <w:t xml:space="preserve"> </w:t>
             </w:r>
             <w:r>
               <w:rPr>
@@ -695,34 +705,77 @@
                 <w:szCs w:val="18"/>
                 <w:u w:val="single"/>
               </w:rPr>
-              <w:t xml:space="preserve">        </w:t>
-            </w:r>
-            <w:r>
-              <w:rPr>
-                <w:rFonts w:ascii="Arial" w:hAnsi="Arial" w:cs="Arial"/>
-                <w:b/>
+              <w:t>{</w:t>
+            </w:r>
+            <w:proofErr w:type="gramEnd"/>
+            <w:r>
+              <w:rPr>
+                <w:rFonts w:ascii="Arial" w:hAnsi="Arial" w:cs="Arial"/>
                 <w:i/>
                 <w:sz w:val="18"/>
                 <w:szCs w:val="18"/>
-              </w:rPr>
-              <w:t xml:space="preserve">         </w:t>
-            </w:r>
-            <w:r>
-              <w:rPr>
-                <w:rFonts w:ascii="Arial" w:hAnsi="Arial" w:cs="Arial"/>
-                <w:b/>
-                <w:sz w:val="18"/>
-                <w:szCs w:val="18"/>
-              </w:rPr>
-              <w:t>RP:</w:t>
-            </w:r>
-            <w:r>
-              <w:rPr>
-                <w:rFonts w:ascii="Arial" w:hAnsi="Arial" w:cs="Arial"/>
-                <w:b/>
+                <w:u w:val="single"/>
+              </w:rPr>
+              <w:t>{cdp</w:t>
+            </w:r>
+            <w:proofErr w:type="gramStart"/>
+            <w:r>
+              <w:rPr>
+                <w:rFonts w:ascii="Arial" w:hAnsi="Arial" w:cs="Arial"/>
                 <w:i/>
                 <w:sz w:val="18"/>
                 <w:szCs w:val="18"/>
+                <w:u w:val="single"/>
+              </w:rPr>
+              <w:t>}}</w:t>
+            </w:r>
+            <w:r>
+              <w:rPr>
+                <w:rFonts w:ascii="Arial" w:hAnsi="Arial" w:cs="Arial"/>
+                <w:b/>
+                <w:i/>
+                <w:sz w:val="18"/>
+                <w:szCs w:val="18"/>
+              </w:rPr>
+              <w:t xml:space="preserve">   </w:t>
+            </w:r>
+            <w:proofErr w:type="gramEnd"/>
+            <w:r>
+              <w:rPr>
+                <w:rFonts w:ascii="Arial" w:hAnsi="Arial" w:cs="Arial"/>
+                <w:b/>
+                <w:i/>
+                <w:sz w:val="18"/>
+                <w:szCs w:val="18"/>
+              </w:rPr>
+              <w:t xml:space="preserve">      </w:t>
+            </w:r>
+            <w:r>
+              <w:rPr>
+                <w:rFonts w:ascii="Arial" w:hAnsi="Arial" w:cs="Arial"/>
+                <w:b/>
+                <w:sz w:val="18"/>
+                <w:szCs w:val="18"/>
+              </w:rPr>
+              <w:t>RP</w:t>
+            </w:r>
+            <w:proofErr w:type="gramStart"/>
+            <w:r>
+              <w:rPr>
+                <w:rFonts w:ascii="Arial" w:hAnsi="Arial" w:cs="Arial"/>
+                <w:b/>
+                <w:sz w:val="18"/>
+                <w:szCs w:val="18"/>
+              </w:rPr>
+              <w:t>:</w:t>
+            </w:r>
+            <w:r>
+              <w:rPr>
+                <w:rFonts w:ascii="Arial" w:hAnsi="Arial" w:cs="Arial"/>
+                <w:b/>
+                <w:i/>
+                <w:sz w:val="18"/>
+                <w:szCs w:val="18"/>
               </w:rPr>
               <w:t xml:space="preserve"> </w:t>
             </w:r>
@@ -734,15 +787,46 @@
                 <w:szCs w:val="18"/>
                 <w:u w:val="single"/>
               </w:rPr>
-              <w:t xml:space="preserve"> {{rp}}</w:t>
-            </w:r>
-            <w:r>
-              <w:rPr>
-                <w:rFonts w:ascii="Arial" w:hAnsi="Arial" w:cs="Arial"/>
-                <w:sz w:val="18"/>
-                <w:szCs w:val="18"/>
-              </w:rPr>
-              <w:t xml:space="preserve">               </w:t>
+              <w:t xml:space="preserve"> {</w:t>
+            </w:r>
+            <w:proofErr w:type="gramEnd"/>
+            <w:r>
+              <w:rPr>
+                <w:rFonts w:ascii="Arial" w:hAnsi="Arial" w:cs="Arial"/>
+                <w:i/>
+                <w:sz w:val="18"/>
+                <w:szCs w:val="18"/>
+                <w:u w:val="single"/>
+              </w:rPr>
+              <w:t>{rp</w:t>
+            </w:r>
+            <w:proofErr w:type="gramStart"/>
+            <w:r>
+              <w:rPr>
+                <w:rFonts w:ascii="Arial" w:hAnsi="Arial" w:cs="Arial"/>
+                <w:i/>
+                <w:sz w:val="18"/>
+                <w:szCs w:val="18"/>
+                <w:u w:val="single"/>
+              </w:rPr>
+              <w:t>}}</w:t>
+            </w:r>
+            <w:r>
+              <w:rPr>
+                <w:rFonts w:ascii="Arial" w:hAnsi="Arial" w:cs="Arial"/>
+                <w:sz w:val="18"/>
+                <w:szCs w:val="18"/>
+              </w:rPr>
+              <w:t xml:space="preserve">   </w:t>
+            </w:r>
+            <w:proofErr w:type="gramEnd"/>
+            <w:r>
+              <w:rPr>
+                <w:rFonts w:ascii="Arial" w:hAnsi="Arial" w:cs="Arial"/>
+                <w:sz w:val="18"/>
+                <w:szCs w:val="18"/>
+              </w:rPr>
+              <w:t xml:space="preserve">            </w:t>
             </w:r>
             <w:r>
               <w:rPr>

</xml_diff>

<commit_message>
ajuste en creacion de formatos y fechas primera ceunta
</commit_message>
<xml_diff>
--- a/backend/templates/FORMATO CERTIFICADO DEL SUPERVISOR.docx
+++ b/backend/templates/FORMATO CERTIFICADO DEL SUPERVISOR.docx
@@ -268,16 +268,7 @@
                 <w:sz w:val="18"/>
                 <w:szCs w:val="18"/>
               </w:rPr>
-              <w:t xml:space="preserve">   {</w:t>
-            </w:r>
-            <w:proofErr w:type="gramEnd"/>
-            <w:r>
-              <w:rPr>
-                <w:rFonts w:ascii="Arial" w:hAnsi="Arial" w:cs="Arial"/>
-                <w:sz w:val="18"/>
-                <w:szCs w:val="18"/>
-              </w:rPr>
-              <w:t>{dependencia}}</w:t>
+              <w:t>{{dependencia}}</w:t>
             </w:r>
           </w:p>
         </w:tc>
@@ -705,111 +696,67 @@
                 <w:szCs w:val="18"/>
                 <w:u w:val="single"/>
               </w:rPr>
-              <w:t>{</w:t>
+              <w:t>{{cdp}}</w:t>
+            </w:r>
+            <w:r>
+              <w:rPr>
+                <w:rFonts w:ascii="Arial" w:hAnsi="Arial" w:cs="Arial"/>
+                <w:b/>
+                <w:i/>
+                <w:sz w:val="18"/>
+                <w:szCs w:val="18"/>
+              </w:rPr>
+              <w:t xml:space="preserve">   </w:t>
             </w:r>
             <w:proofErr w:type="gramEnd"/>
             <w:r>
               <w:rPr>
                 <w:rFonts w:ascii="Arial" w:hAnsi="Arial" w:cs="Arial"/>
+                <w:b/>
                 <w:i/>
                 <w:sz w:val="18"/>
                 <w:szCs w:val="18"/>
+              </w:rPr>
+              <w:t xml:space="preserve">      </w:t>
+            </w:r>
+            <w:r>
+              <w:rPr>
+                <w:rFonts w:ascii="Arial" w:hAnsi="Arial" w:cs="Arial"/>
+                <w:b/>
+                <w:sz w:val="18"/>
+                <w:szCs w:val="18"/>
+              </w:rPr>
+              <w:t>RP</w:t>
+            </w:r>
+            <w:proofErr w:type="gramStart"/>
+            <w:r>
+              <w:rPr>
+                <w:rFonts w:ascii="Arial" w:hAnsi="Arial" w:cs="Arial"/>
+                <w:b/>
+                <w:sz w:val="18"/>
+                <w:szCs w:val="18"/>
+              </w:rPr>
+              <w:t>:</w:t>
+            </w:r>
+            <w:r>
+              <w:rPr>
+                <w:rFonts w:ascii="Arial" w:hAnsi="Arial" w:cs="Arial"/>
+                <w:b/>
+                <w:i/>
+                <w:sz w:val="18"/>
+                <w:szCs w:val="18"/>
+              </w:rPr>
+              <w:t xml:space="preserve"> </w:t>
+            </w:r>
+            <w:r>
+              <w:rPr>
+                <w:rFonts w:ascii="Arial" w:hAnsi="Arial" w:cs="Arial"/>
+                <w:i/>
+                <w:sz w:val="18"/>
+                <w:szCs w:val="18"/>
                 <w:u w:val="single"/>
               </w:rPr>
-              <w:t>{cdp</w:t>
-            </w:r>
-            <w:proofErr w:type="gramStart"/>
-            <w:r>
-              <w:rPr>
-                <w:rFonts w:ascii="Arial" w:hAnsi="Arial" w:cs="Arial"/>
-                <w:i/>
-                <w:sz w:val="18"/>
-                <w:szCs w:val="18"/>
-                <w:u w:val="single"/>
-              </w:rPr>
-              <w:t>}}</w:t>
-            </w:r>
-            <w:r>
-              <w:rPr>
-                <w:rFonts w:ascii="Arial" w:hAnsi="Arial" w:cs="Arial"/>
-                <w:b/>
-                <w:i/>
-                <w:sz w:val="18"/>
-                <w:szCs w:val="18"/>
-              </w:rPr>
-              <w:t xml:space="preserve">   </w:t>
-            </w:r>
-            <w:proofErr w:type="gramEnd"/>
-            <w:r>
-              <w:rPr>
-                <w:rFonts w:ascii="Arial" w:hAnsi="Arial" w:cs="Arial"/>
-                <w:b/>
-                <w:i/>
-                <w:sz w:val="18"/>
-                <w:szCs w:val="18"/>
-              </w:rPr>
-              <w:t xml:space="preserve">      </w:t>
-            </w:r>
-            <w:r>
-              <w:rPr>
-                <w:rFonts w:ascii="Arial" w:hAnsi="Arial" w:cs="Arial"/>
-                <w:b/>
-                <w:sz w:val="18"/>
-                <w:szCs w:val="18"/>
-              </w:rPr>
-              <w:t>RP</w:t>
-            </w:r>
-            <w:proofErr w:type="gramStart"/>
-            <w:r>
-              <w:rPr>
-                <w:rFonts w:ascii="Arial" w:hAnsi="Arial" w:cs="Arial"/>
-                <w:b/>
-                <w:sz w:val="18"/>
-                <w:szCs w:val="18"/>
-              </w:rPr>
-              <w:t>:</w:t>
-            </w:r>
-            <w:r>
-              <w:rPr>
-                <w:rFonts w:ascii="Arial" w:hAnsi="Arial" w:cs="Arial"/>
-                <w:b/>
-                <w:i/>
-                <w:sz w:val="18"/>
-                <w:szCs w:val="18"/>
-              </w:rPr>
-              <w:t xml:space="preserve"> </w:t>
-            </w:r>
-            <w:r>
-              <w:rPr>
-                <w:rFonts w:ascii="Arial" w:hAnsi="Arial" w:cs="Arial"/>
-                <w:i/>
-                <w:sz w:val="18"/>
-                <w:szCs w:val="18"/>
-                <w:u w:val="single"/>
-              </w:rPr>
-              <w:t xml:space="preserve"> {</w:t>
-            </w:r>
-            <w:proofErr w:type="gramEnd"/>
-            <w:r>
-              <w:rPr>
-                <w:rFonts w:ascii="Arial" w:hAnsi="Arial" w:cs="Arial"/>
-                <w:i/>
-                <w:sz w:val="18"/>
-                <w:szCs w:val="18"/>
-                <w:u w:val="single"/>
-              </w:rPr>
-              <w:t>{rp</w:t>
-            </w:r>
-            <w:proofErr w:type="gramStart"/>
-            <w:r>
-              <w:rPr>
-                <w:rFonts w:ascii="Arial" w:hAnsi="Arial" w:cs="Arial"/>
-                <w:i/>
-                <w:sz w:val="18"/>
-                <w:szCs w:val="18"/>
-                <w:u w:val="single"/>
-              </w:rPr>
-              <w:t>}}</w:t>
+              <w:t>{{rp}}</w:t>
             </w:r>
             <w:r>
               <w:rPr>
@@ -1242,7 +1189,6 @@
                 <w:ilvl w:val="0"/>
                 <w:numId w:val="2"/>
               </w:numPr>
-              <w:spacing w:after="120"/>
               <w:ind w:left="714" w:hanging="357"/>
               <w:rPr>
                 <w:rFonts w:ascii="Arial" w:hAnsi="Arial" w:cs="Arial"/>
@@ -1257,7 +1203,7 @@
                 <w:szCs w:val="18"/>
                 <w:lang w:val="es-ES"/>
               </w:rPr>
-              <w:t xml:space="preserve">Informe del contratista: # de folios {{soporte_informe_contratista_folios}} </w:t>
+              <w:t xml:space="preserve">Informe del contratista: {{soporte_informe_contratista_folios}} folio(s).</w:t>
             </w:r>
           </w:p>
           <w:p>
@@ -1267,20 +1213,20 @@
                 <w:ilvl w:val="0"/>
                 <w:numId w:val="2"/>
               </w:numPr>
-              <w:spacing w:after="120"/>
               <w:ind w:left="714" w:hanging="357"/>
               <w:rPr>
                 <w:rFonts w:ascii="Arial" w:hAnsi="Arial" w:cs="Arial"/>
-                <w:szCs w:val="18"/>
-              </w:rPr>
-            </w:pPr>
-            <w:r>
-              <w:rPr>
-                <w:rFonts w:ascii="Arial" w:hAnsi="Arial" w:cs="Arial"/>
                 <w:b w:val="0"/>
                 <w:szCs w:val="18"/>
               </w:rPr>
-              <w:t>Informe del supervisor y/o interventor: # de folios {{soporte_informe_supervisor_folios}}</w:t>
+            </w:pPr>
+            <w:r>
+              <w:rPr>
+                <w:rFonts w:ascii="Arial" w:hAnsi="Arial" w:cs="Arial"/>
+                <w:b w:val="0"/>
+                <w:szCs w:val="18"/>
+              </w:rPr>
+              <w:t>Informe del supervisor y/o interventor: {{soporte_informe_supervisor_folios}} folio(s).</w:t>
             </w:r>
           </w:p>
           <w:p>
@@ -1291,7 +1237,6 @@
               </w:numPr>
               <w:rPr>
                 <w:rFonts w:ascii="Arial" w:hAnsi="Arial" w:cs="Arial"/>
-                <w:b/>
                 <w:sz w:val="18"/>
                 <w:szCs w:val="18"/>
                 <w:lang w:val="es-CO" w:eastAsia="es-CO"/>
@@ -1304,7 +1249,146 @@
                 <w:szCs w:val="18"/>
                 <w:lang w:val="es-CO"/>
               </w:rPr>
-              <w:t>Otros: {{soportes_otros}}</w:t>
+              <w:t>Planilla de Seguridad Social: {{soporte_planilla_folios}} folio(s).</w:t>
+            </w:r>
+          </w:p>
+          <w:p>
+            <w:pPr>
+              <w:numPr>
+                <w:ilvl w:val="0"/>
+                <w:numId w:val="2"/>
+              </w:numPr>
+              <w:rPr>
+                <w:rFonts w:ascii="Arial" w:hAnsi="Arial" w:cs="Arial"/>
+                <w:sz w:val="18"/>
+                <w:szCs w:val="18"/>
+                <w:lang w:val="es-CO" w:eastAsia="es-CO"/>
+              </w:rPr>
+            </w:pPr>
+            <w:r>
+              <w:rPr>
+                <w:rFonts w:ascii="Arial" w:hAnsi="Arial" w:cs="Arial"/>
+                <w:sz w:val="18"/>
+                <w:szCs w:val="18"/>
+                <w:lang w:val="es-CO"/>
+              </w:rPr>
+              <w:t>Recibo de pago: {{soporte_recibo_folios}} folio(s)</w:t>
+            </w:r>
+          </w:p>
+          <w:p>
+            <w:pPr>
+              <w:numPr>
+                <w:ilvl w:val="0"/>
+                <w:numId w:val="2"/>
+              </w:numPr>
+              <w:rPr>
+                <w:rFonts w:ascii="Arial" w:hAnsi="Arial" w:cs="Arial"/>
+                <w:sz w:val="18"/>
+                <w:szCs w:val="18"/>
+                <w:lang w:val="es-CO" w:eastAsia="es-CO"/>
+              </w:rPr>
+            </w:pPr>
+            <w:r>
+              <w:rPr>
+                <w:rFonts w:ascii="Arial" w:hAnsi="Arial" w:cs="Arial"/>
+                <w:sz w:val="18"/>
+                <w:szCs w:val="18"/>
+                <w:lang w:val="es-CO"/>
+              </w:rPr>
+              <w:t>RUT: 1 folio(s)</w:t>
+            </w:r>
+          </w:p>
+          <w:p>
+            <w:pPr>
+              <w:numPr>
+                <w:ilvl w:val="0"/>
+                <w:numId w:val="2"/>
+              </w:numPr>
+              <w:rPr>
+                <w:rFonts w:ascii="Arial" w:hAnsi="Arial" w:cs="Arial"/>
+                <w:sz w:val="18"/>
+                <w:szCs w:val="18"/>
+                <w:lang w:val="es-CO" w:eastAsia="es-CO"/>
+              </w:rPr>
+            </w:pPr>
+            <w:r>
+              <w:rPr>
+                <w:rFonts w:ascii="Arial" w:hAnsi="Arial" w:cs="Arial"/>
+                <w:sz w:val="18"/>
+                <w:szCs w:val="18"/>
+                <w:lang w:val="es-CO"/>
+              </w:rPr>
+              <w:t>Certificación Bancaria: 1 folio(s)</w:t>
+            </w:r>
+          </w:p>
+          <w:p>
+            <w:pPr>
+              <w:numPr>
+                <w:ilvl w:val="0"/>
+                <w:numId w:val="2"/>
+              </w:numPr>
+              <w:rPr>
+                <w:rFonts w:ascii="Arial" w:hAnsi="Arial" w:cs="Arial"/>
+                <w:sz w:val="18"/>
+                <w:szCs w:val="18"/>
+                <w:lang w:val="es-CO" w:eastAsia="es-CO"/>
+              </w:rPr>
+            </w:pPr>
+            <w:r>
+              <w:rPr>
+                <w:rFonts w:ascii="Arial" w:hAnsi="Arial" w:cs="Arial"/>
+                <w:sz w:val="18"/>
+                <w:szCs w:val="18"/>
+                <w:lang w:val="es-CO"/>
+              </w:rPr>
+              <w:t>Descuento de Estampillas 1 folio(s)</w:t>
+            </w:r>
+          </w:p>
+          <w:p>
+            <w:pPr>
+              <w:numPr>
+                <w:ilvl w:val="0"/>
+                <w:numId w:val="2"/>
+              </w:numPr>
+              <w:rPr>
+                <w:rFonts w:ascii="Arial" w:hAnsi="Arial" w:cs="Arial"/>
+                <w:sz w:val="18"/>
+                <w:szCs w:val="18"/>
+                <w:lang w:val="es-CO" w:eastAsia="es-CO"/>
+              </w:rPr>
+            </w:pPr>
+            <w:r>
+              <w:rPr>
+                <w:rFonts w:ascii="Arial" w:hAnsi="Arial" w:cs="Arial"/>
+                <w:sz w:val="18"/>
+                <w:szCs w:val="18"/>
+                <w:lang w:val="es-CO"/>
+              </w:rPr>
+              <w:t>Retención en la Fuente: 1 folio(s)</w:t>
+            </w:r>
+          </w:p>
+          <w:p>
+            <w:pPr>
+              <w:numPr>
+                <w:ilvl w:val="0"/>
+                <w:numId w:val="2"/>
+              </w:numPr>
+              <w:rPr>
+                <w:rFonts w:ascii="Arial" w:hAnsi="Arial" w:cs="Arial"/>
+                <w:b/>
+                <w:sz w:val="18"/>
+                <w:szCs w:val="18"/>
+                <w:lang w:val="es-CO" w:eastAsia="es-CO"/>
+              </w:rPr>
+            </w:pPr>
+            <w:r>
+              <w:rPr>
+                <w:rFonts w:ascii="Arial" w:hAnsi="Arial" w:cs="Arial"/>
+                <w:sz w:val="18"/>
+                <w:szCs w:val="18"/>
+                <w:lang w:val="es-CO" w:eastAsia="es-CO"/>
+              </w:rPr>
+              <w:t>RP: 1 folio(s)</w:t>
             </w:r>
           </w:p>
         </w:tc>
@@ -1541,24 +1625,24 @@
                 <w:sz w:val="18"/>
                 <w:szCs w:val="18"/>
               </w:rPr>
-              <w:t>QUE CORRESPONDE A: ANTICIPO {{chk_anticipo}} PRIMERO{{chk_primero}} SEGUNDO{{chk_segundo}}   TERCERO{{chk_tercero}} CUARTO{{chk_cuarto}} QUINTO{{chk_quinto}} SEXTO{{chk_sexto}}</w:t>
-            </w:r>
-          </w:p>
-          <w:p>
-            <w:pPr>
-              <w:rPr>
-                <w:rFonts w:ascii="Arial" w:hAnsi="Arial" w:cs="Arial"/>
-                <w:sz w:val="18"/>
-                <w:szCs w:val="18"/>
-              </w:rPr>
-            </w:pPr>
-            <w:r>
-              <w:rPr>
-                <w:rFonts w:ascii="Arial" w:hAnsi="Arial" w:cs="Arial"/>
-                <w:sz w:val="18"/>
-                <w:szCs w:val="18"/>
-              </w:rPr>
-              <w:t xml:space="preserve">SEPTIMO{{chk_septimo}} OCTAVO{{chk_octavo}} NOVENO{{chk_noveno}} OTROS{{chk_otros}} CUAL: {{otros_cual}} </w:t>
+              <w:t>QUE CORRESPONDE A: ANTICIPO {{chk_anticipo}} PRIMERO {{chk_primero}} SEGUNDO {{chk_segundo}}   TERCERO {{chk_tercero}} CUARTO {{chk_cuarto}} QUINTO {{chk_quinto}} SEXTO {{chk_sexto}}</w:t>
+            </w:r>
+          </w:p>
+          <w:p>
+            <w:pPr>
+              <w:rPr>
+                <w:rFonts w:ascii="Arial" w:hAnsi="Arial" w:cs="Arial"/>
+                <w:sz w:val="18"/>
+                <w:szCs w:val="18"/>
+              </w:rPr>
+            </w:pPr>
+            <w:r>
+              <w:rPr>
+                <w:rFonts w:ascii="Arial" w:hAnsi="Arial" w:cs="Arial"/>
+                <w:sz w:val="18"/>
+                <w:szCs w:val="18"/>
+              </w:rPr>
+              <w:t xml:space="preserve">SEPTIMO {{chk_septimo}} OCTAVO {{chk_octavo}} NOVENO {{chk_noveno}} OTROS {{chk_otros}} CUAL: {{otros_cual}} </w:t>
             </w:r>
           </w:p>
         </w:tc>

</xml_diff>

<commit_message>
ajuste de cogido presupuestal
</commit_message>
<xml_diff>
--- a/backend/templates/FORMATO CERTIFICADO DEL SUPERVISOR.docx
+++ b/backend/templates/FORMATO CERTIFICADO DEL SUPERVISOR.docx
@@ -192,13 +192,41 @@
               <w:t>fecha_certificado</w:t>
             </w:r>
             <w:proofErr w:type="spellEnd"/>
-            <w:r>
-              <w:rPr>
-                <w:rFonts w:ascii="Arial" w:hAnsi="Arial" w:cs="Arial"/>
-                <w:sz w:val="18"/>
-                <w:szCs w:val="18"/>
-              </w:rPr>
-              <w:t>}}                                     {{</w:t>
+            <w:proofErr w:type="gramStart"/>
+            <w:r>
+              <w:rPr>
+                <w:rFonts w:ascii="Arial" w:hAnsi="Arial" w:cs="Arial"/>
+                <w:sz w:val="18"/>
+                <w:szCs w:val="18"/>
+              </w:rPr>
+              <w:t xml:space="preserve">}}   </w:t>
+            </w:r>
+            <w:proofErr w:type="gramEnd"/>
+            <w:r>
+              <w:rPr>
+                <w:rFonts w:ascii="Arial" w:hAnsi="Arial" w:cs="Arial"/>
+                <w:sz w:val="18"/>
+                <w:szCs w:val="18"/>
+              </w:rPr>
+              <w:t xml:space="preserve">                               </w:t>
+            </w:r>
+            <w:proofErr w:type="gramStart"/>
+            <w:r>
+              <w:rPr>
+                <w:rFonts w:ascii="Arial" w:hAnsi="Arial" w:cs="Arial"/>
+                <w:sz w:val="18"/>
+                <w:szCs w:val="18"/>
+              </w:rPr>
+              <w:t xml:space="preserve">   {</w:t>
+            </w:r>
+            <w:proofErr w:type="gramEnd"/>
+            <w:r>
+              <w:rPr>
+                <w:rFonts w:ascii="Arial" w:hAnsi="Arial" w:cs="Arial"/>
+                <w:sz w:val="18"/>
+                <w:szCs w:val="18"/>
+              </w:rPr>
+              <w:t>{</w:t>
             </w:r>
             <w:proofErr w:type="spellStart"/>
             <w:r>
@@ -210,13 +238,23 @@
               <w:t>nombre_supervisor</w:t>
             </w:r>
             <w:proofErr w:type="spellEnd"/>
-            <w:r>
-              <w:rPr>
-                <w:rFonts w:ascii="Arial" w:hAnsi="Arial" w:cs="Arial"/>
-                <w:sz w:val="18"/>
-                <w:szCs w:val="18"/>
-              </w:rPr>
-              <w:t xml:space="preserve">}}              </w:t>
+            <w:proofErr w:type="gramStart"/>
+            <w:r>
+              <w:rPr>
+                <w:rFonts w:ascii="Arial" w:hAnsi="Arial" w:cs="Arial"/>
+                <w:sz w:val="18"/>
+                <w:szCs w:val="18"/>
+              </w:rPr>
+              <w:t xml:space="preserve">}}   </w:t>
+            </w:r>
+            <w:proofErr w:type="gramEnd"/>
+            <w:r>
+              <w:rPr>
+                <w:rFonts w:ascii="Arial" w:hAnsi="Arial" w:cs="Arial"/>
+                <w:sz w:val="18"/>
+                <w:szCs w:val="18"/>
+              </w:rPr>
+              <w:t xml:space="preserve">           </w:t>
             </w:r>
             <w:r>
               <w:rPr>
@@ -240,15 +278,33 @@
                 <w:sz w:val="18"/>
                 <w:szCs w:val="18"/>
               </w:rPr>
-              <w:t xml:space="preserve">    </w:t>
-            </w:r>
-            <w:r>
-              <w:rPr>
-                <w:rFonts w:ascii="Arial" w:hAnsi="Arial" w:cs="Arial"/>
-                <w:sz w:val="18"/>
-                <w:szCs w:val="18"/>
-              </w:rPr>
-              <w:t>{{dependencia}}</w:t>
+              <w:t xml:space="preserve"> </w:t>
+            </w:r>
+            <w:proofErr w:type="gramStart"/>
+            <w:r>
+              <w:rPr>
+                <w:rFonts w:ascii="Arial" w:hAnsi="Arial" w:cs="Arial"/>
+                <w:sz w:val="18"/>
+                <w:szCs w:val="18"/>
+              </w:rPr>
+              <w:t xml:space="preserve">   </w:t>
+            </w:r>
+            <w:r>
+              <w:rPr>
+                <w:rFonts w:ascii="Arial" w:hAnsi="Arial" w:cs="Arial"/>
+                <w:sz w:val="18"/>
+                <w:szCs w:val="18"/>
+              </w:rPr>
+              <w:t>{</w:t>
+            </w:r>
+            <w:proofErr w:type="gramEnd"/>
+            <w:r>
+              <w:rPr>
+                <w:rFonts w:ascii="Arial" w:hAnsi="Arial" w:cs="Arial"/>
+                <w:sz w:val="18"/>
+                <w:szCs w:val="18"/>
+              </w:rPr>
+              <w:t>{dependencia}}</w:t>
             </w:r>
           </w:p>
         </w:tc>
@@ -673,7 +729,27 @@
                 <w:szCs w:val="18"/>
                 <w:u w:val="single"/>
               </w:rPr>
-              <w:t xml:space="preserve">    {{</w:t>
+              <w:t xml:space="preserve"> </w:t>
+            </w:r>
+            <w:proofErr w:type="gramStart"/>
+            <w:r>
+              <w:rPr>
+                <w:rFonts w:ascii="Arial" w:hAnsi="Arial" w:cs="Arial"/>
+                <w:sz w:val="18"/>
+                <w:szCs w:val="18"/>
+                <w:u w:val="single"/>
+              </w:rPr>
+              <w:t xml:space="preserve">   {</w:t>
+            </w:r>
+            <w:proofErr w:type="gramEnd"/>
+            <w:r>
+              <w:rPr>
+                <w:rFonts w:ascii="Arial" w:hAnsi="Arial" w:cs="Arial"/>
+                <w:sz w:val="18"/>
+                <w:szCs w:val="18"/>
+                <w:u w:val="single"/>
+              </w:rPr>
+              <w:t>{</w:t>
             </w:r>
             <w:proofErr w:type="spellStart"/>
             <w:r>
@@ -686,6 +762,7 @@
               <w:t>fecha_acta_inicio</w:t>
             </w:r>
             <w:proofErr w:type="spellEnd"/>
+            <w:proofErr w:type="gramStart"/>
             <w:r>
               <w:rPr>
                 <w:rFonts w:ascii="Arial" w:hAnsi="Arial" w:cs="Arial"/>
@@ -701,16 +778,261 @@
                 <w:sz w:val="18"/>
                 <w:szCs w:val="18"/>
               </w:rPr>
+              <w:t xml:space="preserve">   </w:t>
+            </w:r>
+            <w:proofErr w:type="gramEnd"/>
+            <w:r>
+              <w:rPr>
+                <w:rFonts w:ascii="Arial" w:hAnsi="Arial" w:cs="Arial"/>
+                <w:sz w:val="18"/>
+                <w:szCs w:val="18"/>
+              </w:rPr>
+              <w:t xml:space="preserve">       </w:t>
+            </w:r>
+            <w:r>
+              <w:rPr>
+                <w:rFonts w:ascii="Arial" w:hAnsi="Arial" w:cs="Arial"/>
+                <w:b/>
+                <w:sz w:val="18"/>
+                <w:szCs w:val="18"/>
+              </w:rPr>
+              <w:t>FECHA DE TERMINACION:</w:t>
+            </w:r>
+            <w:r>
+              <w:rPr>
+                <w:rFonts w:ascii="Arial" w:hAnsi="Arial" w:cs="Arial"/>
+                <w:sz w:val="18"/>
+                <w:szCs w:val="18"/>
+              </w:rPr>
+              <w:t xml:space="preserve"> {{</w:t>
+            </w:r>
+            <w:proofErr w:type="spellStart"/>
+            <w:r>
+              <w:rPr>
+                <w:rFonts w:ascii="Arial" w:hAnsi="Arial" w:cs="Arial"/>
+                <w:sz w:val="18"/>
+                <w:szCs w:val="18"/>
+              </w:rPr>
+              <w:t>fecha_terminacion</w:t>
+            </w:r>
+            <w:proofErr w:type="spellEnd"/>
+            <w:r>
+              <w:rPr>
+                <w:rFonts w:ascii="Arial" w:hAnsi="Arial" w:cs="Arial"/>
+                <w:sz w:val="18"/>
+                <w:szCs w:val="18"/>
+              </w:rPr>
+              <w:t>}}</w:t>
+            </w:r>
+            <w:r>
+              <w:rPr>
+                <w:rFonts w:ascii="Arial" w:hAnsi="Arial" w:cs="Arial"/>
+                <w:b/>
+                <w:sz w:val="18"/>
+                <w:szCs w:val="18"/>
+              </w:rPr>
               <w:t xml:space="preserve">          </w:t>
             </w:r>
-            <w:r>
-              <w:rPr>
-                <w:rFonts w:ascii="Arial" w:hAnsi="Arial" w:cs="Arial"/>
-                <w:b/>
-                <w:sz w:val="18"/>
-                <w:szCs w:val="18"/>
-              </w:rPr>
-              <w:t>FECHA DE TERMINACION:</w:t>
+          </w:p>
+          <w:p>
+            <w:pPr>
+              <w:rPr>
+                <w:rFonts w:ascii="Arial" w:hAnsi="Arial" w:cs="Arial"/>
+                <w:b/>
+                <w:sz w:val="18"/>
+                <w:szCs w:val="18"/>
+              </w:rPr>
+            </w:pPr>
+          </w:p>
+          <w:p>
+            <w:pPr>
+              <w:rPr>
+                <w:rFonts w:ascii="Arial" w:hAnsi="Arial" w:cs="Arial"/>
+                <w:b/>
+                <w:sz w:val="18"/>
+                <w:szCs w:val="18"/>
+              </w:rPr>
+            </w:pPr>
+            <w:r>
+              <w:rPr>
+                <w:rFonts w:ascii="Arial" w:hAnsi="Arial" w:cs="Arial"/>
+                <w:b/>
+                <w:sz w:val="18"/>
+                <w:szCs w:val="18"/>
+              </w:rPr>
+              <w:t>CDP</w:t>
+            </w:r>
+            <w:proofErr w:type="gramStart"/>
+            <w:r>
+              <w:rPr>
+                <w:rFonts w:ascii="Arial" w:hAnsi="Arial" w:cs="Arial"/>
+                <w:b/>
+                <w:sz w:val="18"/>
+                <w:szCs w:val="18"/>
+              </w:rPr>
+              <w:t>:</w:t>
+            </w:r>
+            <w:r>
+              <w:rPr>
+                <w:rFonts w:ascii="Arial" w:hAnsi="Arial" w:cs="Arial"/>
+                <w:b/>
+                <w:i/>
+                <w:sz w:val="18"/>
+                <w:szCs w:val="18"/>
+              </w:rPr>
+              <w:t xml:space="preserve"> </w:t>
+            </w:r>
+            <w:r>
+              <w:rPr>
+                <w:rFonts w:ascii="Arial" w:hAnsi="Arial" w:cs="Arial"/>
+                <w:i/>
+                <w:sz w:val="18"/>
+                <w:szCs w:val="18"/>
+              </w:rPr>
+              <w:t xml:space="preserve"> </w:t>
+            </w:r>
+            <w:r>
+              <w:rPr>
+                <w:rFonts w:ascii="Arial" w:hAnsi="Arial" w:cs="Arial"/>
+                <w:i/>
+                <w:sz w:val="18"/>
+                <w:szCs w:val="18"/>
+                <w:u w:val="single"/>
+              </w:rPr>
+              <w:t>{</w:t>
+            </w:r>
+            <w:proofErr w:type="gramEnd"/>
+            <w:r>
+              <w:rPr>
+                <w:rFonts w:ascii="Arial" w:hAnsi="Arial" w:cs="Arial"/>
+                <w:i/>
+                <w:sz w:val="18"/>
+                <w:szCs w:val="18"/>
+                <w:u w:val="single"/>
+              </w:rPr>
+              <w:t>{</w:t>
+            </w:r>
+            <w:proofErr w:type="spellStart"/>
+            <w:r>
+              <w:rPr>
+                <w:rFonts w:ascii="Arial" w:hAnsi="Arial" w:cs="Arial"/>
+                <w:i/>
+                <w:sz w:val="18"/>
+                <w:szCs w:val="18"/>
+                <w:u w:val="single"/>
+              </w:rPr>
+              <w:t>cdp</w:t>
+            </w:r>
+            <w:proofErr w:type="spellEnd"/>
+            <w:proofErr w:type="gramStart"/>
+            <w:r>
+              <w:rPr>
+                <w:rFonts w:ascii="Arial" w:hAnsi="Arial" w:cs="Arial"/>
+                <w:i/>
+                <w:sz w:val="18"/>
+                <w:szCs w:val="18"/>
+                <w:u w:val="single"/>
+              </w:rPr>
+              <w:t>}}</w:t>
+            </w:r>
+            <w:r>
+              <w:rPr>
+                <w:rFonts w:ascii="Arial" w:hAnsi="Arial" w:cs="Arial"/>
+                <w:b/>
+                <w:i/>
+                <w:sz w:val="18"/>
+                <w:szCs w:val="18"/>
+              </w:rPr>
+              <w:t xml:space="preserve">   </w:t>
+            </w:r>
+            <w:proofErr w:type="gramEnd"/>
+            <w:r>
+              <w:rPr>
+                <w:rFonts w:ascii="Arial" w:hAnsi="Arial" w:cs="Arial"/>
+                <w:b/>
+                <w:i/>
+                <w:sz w:val="18"/>
+                <w:szCs w:val="18"/>
+              </w:rPr>
+              <w:t xml:space="preserve">      </w:t>
+            </w:r>
+            <w:r>
+              <w:rPr>
+                <w:rFonts w:ascii="Arial" w:hAnsi="Arial" w:cs="Arial"/>
+                <w:b/>
+                <w:sz w:val="18"/>
+                <w:szCs w:val="18"/>
+              </w:rPr>
+              <w:t>RP:</w:t>
+            </w:r>
+            <w:r>
+              <w:rPr>
+                <w:rFonts w:ascii="Arial" w:hAnsi="Arial" w:cs="Arial"/>
+                <w:b/>
+                <w:i/>
+                <w:sz w:val="18"/>
+                <w:szCs w:val="18"/>
+              </w:rPr>
+              <w:t xml:space="preserve"> </w:t>
+            </w:r>
+            <w:r>
+              <w:rPr>
+                <w:rFonts w:ascii="Arial" w:hAnsi="Arial" w:cs="Arial"/>
+                <w:i/>
+                <w:sz w:val="18"/>
+                <w:szCs w:val="18"/>
+                <w:u w:val="single"/>
+              </w:rPr>
+              <w:t>{{</w:t>
+            </w:r>
+            <w:proofErr w:type="spellStart"/>
+            <w:r>
+              <w:rPr>
+                <w:rFonts w:ascii="Arial" w:hAnsi="Arial" w:cs="Arial"/>
+                <w:i/>
+                <w:sz w:val="18"/>
+                <w:szCs w:val="18"/>
+                <w:u w:val="single"/>
+              </w:rPr>
+              <w:t>rp</w:t>
+            </w:r>
+            <w:proofErr w:type="spellEnd"/>
+            <w:proofErr w:type="gramStart"/>
+            <w:r>
+              <w:rPr>
+                <w:rFonts w:ascii="Arial" w:hAnsi="Arial" w:cs="Arial"/>
+                <w:i/>
+                <w:sz w:val="18"/>
+                <w:szCs w:val="18"/>
+                <w:u w:val="single"/>
+              </w:rPr>
+              <w:t>}}</w:t>
+            </w:r>
+            <w:r>
+              <w:rPr>
+                <w:rFonts w:ascii="Arial" w:hAnsi="Arial" w:cs="Arial"/>
+                <w:sz w:val="18"/>
+                <w:szCs w:val="18"/>
+              </w:rPr>
+              <w:t xml:space="preserve">   </w:t>
+            </w:r>
+            <w:proofErr w:type="gramEnd"/>
+            <w:r>
+              <w:rPr>
+                <w:rFonts w:ascii="Arial" w:hAnsi="Arial" w:cs="Arial"/>
+                <w:sz w:val="18"/>
+                <w:szCs w:val="18"/>
+              </w:rPr>
+              <w:t xml:space="preserve">            </w:t>
+            </w:r>
+            <w:r>
+              <w:rPr>
+                <w:rFonts w:ascii="Arial" w:hAnsi="Arial" w:cs="Arial"/>
+                <w:b/>
+                <w:sz w:val="18"/>
+                <w:szCs w:val="18"/>
+              </w:rPr>
+              <w:t>Código (Rubro Presupuestal):</w:t>
             </w:r>
             <w:r>
               <w:rPr>
@@ -727,7 +1049,7 @@
                 <w:sz w:val="18"/>
                 <w:szCs w:val="18"/>
               </w:rPr>
-              <w:t>fecha_terminacion</w:t>
+              <w:t>rubro_presupuestal</w:t>
             </w:r>
             <w:proofErr w:type="spellEnd"/>
             <w:r>
@@ -738,49 +1060,60 @@
               </w:rPr>
               <w:t>}}</w:t>
             </w:r>
-            <w:r>
-              <w:rPr>
-                <w:rFonts w:ascii="Arial" w:hAnsi="Arial" w:cs="Arial"/>
-                <w:b/>
-                <w:sz w:val="18"/>
-                <w:szCs w:val="18"/>
-              </w:rPr>
-              <w:t xml:space="preserve">          </w:t>
-            </w:r>
-          </w:p>
-          <w:p>
-            <w:pPr>
-              <w:rPr>
-                <w:rFonts w:ascii="Arial" w:hAnsi="Arial" w:cs="Arial"/>
-                <w:b/>
-                <w:sz w:val="18"/>
-                <w:szCs w:val="18"/>
-              </w:rPr>
-            </w:pPr>
-          </w:p>
-          <w:p>
-            <w:pPr>
-              <w:rPr>
-                <w:rFonts w:ascii="Arial" w:hAnsi="Arial" w:cs="Arial"/>
-                <w:b/>
-                <w:sz w:val="18"/>
-                <w:szCs w:val="18"/>
-              </w:rPr>
-            </w:pPr>
-            <w:r>
-              <w:rPr>
-                <w:rFonts w:ascii="Arial" w:hAnsi="Arial" w:cs="Arial"/>
-                <w:b/>
-                <w:sz w:val="18"/>
-                <w:szCs w:val="18"/>
-              </w:rPr>
-              <w:t>CDP:</w:t>
-            </w:r>
-            <w:r>
-              <w:rPr>
-                <w:rFonts w:ascii="Arial" w:hAnsi="Arial" w:cs="Arial"/>
-                <w:b/>
-                <w:i/>
+          </w:p>
+          <w:p>
+            <w:pPr>
+              <w:rPr>
+                <w:rFonts w:ascii="Arial" w:hAnsi="Arial" w:cs="Arial"/>
+                <w:b/>
+                <w:sz w:val="18"/>
+                <w:szCs w:val="18"/>
+              </w:rPr>
+            </w:pPr>
+          </w:p>
+          <w:p>
+            <w:r>
+              <w:rPr>
+                <w:rFonts w:ascii="Arial" w:hAnsi="Arial" w:cs="Arial"/>
+                <w:b/>
+                <w:sz w:val="18"/>
+                <w:szCs w:val="18"/>
+              </w:rPr>
+              <w:t xml:space="preserve">VALOR TOTAL: </w:t>
+            </w:r>
+            <w:r>
+              <w:rPr>
+                <w:rFonts w:ascii="Arial" w:hAnsi="Arial" w:cs="Arial"/>
+                <w:sz w:val="18"/>
+                <w:szCs w:val="18"/>
+                <w:u w:val="single"/>
+              </w:rPr>
+              <w:t>{{</w:t>
+            </w:r>
+            <w:proofErr w:type="spellStart"/>
+            <w:r>
+              <w:rPr>
+                <w:rFonts w:ascii="Arial" w:hAnsi="Arial" w:cs="Arial"/>
+                <w:sz w:val="18"/>
+                <w:szCs w:val="18"/>
+                <w:u w:val="single"/>
+              </w:rPr>
+              <w:t>valor_total</w:t>
+            </w:r>
+            <w:proofErr w:type="spellEnd"/>
+            <w:proofErr w:type="gramStart"/>
+            <w:r>
+              <w:rPr>
+                <w:rFonts w:ascii="Arial" w:hAnsi="Arial" w:cs="Arial"/>
+                <w:sz w:val="18"/>
+                <w:szCs w:val="18"/>
+                <w:u w:val="single"/>
+              </w:rPr>
+              <w:t>}}</w:t>
+            </w:r>
+            <w:r>
+              <w:rPr>
+                <w:rFonts w:ascii="Arial" w:hAnsi="Arial" w:cs="Arial"/>
                 <w:sz w:val="18"/>
                 <w:szCs w:val="18"/>
               </w:rPr>
@@ -789,214 +1122,21 @@
             <w:r>
               <w:rPr>
                 <w:rFonts w:ascii="Arial" w:hAnsi="Arial" w:cs="Arial"/>
-                <w:i/>
-                <w:sz w:val="18"/>
-                <w:szCs w:val="18"/>
-              </w:rPr>
-              <w:t xml:space="preserve"> </w:t>
-            </w:r>
-            <w:r>
-              <w:rPr>
-                <w:rFonts w:ascii="Arial" w:hAnsi="Arial" w:cs="Arial"/>
-                <w:i/>
-                <w:sz w:val="18"/>
-                <w:szCs w:val="18"/>
-                <w:u w:val="single"/>
-              </w:rPr>
-              <w:t>{{</w:t>
-            </w:r>
-            <w:proofErr w:type="spellStart"/>
-            <w:r>
-              <w:rPr>
-                <w:rFonts w:ascii="Arial" w:hAnsi="Arial" w:cs="Arial"/>
-                <w:i/>
-                <w:sz w:val="18"/>
-                <w:szCs w:val="18"/>
-                <w:u w:val="single"/>
-              </w:rPr>
-              <w:t>cdp</w:t>
-            </w:r>
-            <w:proofErr w:type="spellEnd"/>
-            <w:r>
-              <w:rPr>
-                <w:rFonts w:ascii="Arial" w:hAnsi="Arial" w:cs="Arial"/>
-                <w:i/>
-                <w:sz w:val="18"/>
-                <w:szCs w:val="18"/>
-                <w:u w:val="single"/>
-              </w:rPr>
-              <w:t>}}</w:t>
-            </w:r>
-            <w:r>
-              <w:rPr>
-                <w:rFonts w:ascii="Arial" w:hAnsi="Arial" w:cs="Arial"/>
-                <w:b/>
-                <w:i/>
-                <w:sz w:val="18"/>
-                <w:szCs w:val="18"/>
-              </w:rPr>
-              <w:t xml:space="preserve">         </w:t>
-            </w:r>
-            <w:r>
-              <w:rPr>
-                <w:rFonts w:ascii="Arial" w:hAnsi="Arial" w:cs="Arial"/>
-                <w:b/>
-                <w:sz w:val="18"/>
-                <w:szCs w:val="18"/>
-              </w:rPr>
-              <w:t>RP:</w:t>
-            </w:r>
-            <w:r>
-              <w:rPr>
-                <w:rFonts w:ascii="Arial" w:hAnsi="Arial" w:cs="Arial"/>
-                <w:b/>
-                <w:i/>
-                <w:sz w:val="18"/>
-                <w:szCs w:val="18"/>
-              </w:rPr>
-              <w:t xml:space="preserve"> </w:t>
-            </w:r>
-            <w:r>
-              <w:rPr>
-                <w:rFonts w:ascii="Arial" w:hAnsi="Arial" w:cs="Arial"/>
-                <w:i/>
-                <w:sz w:val="18"/>
-                <w:szCs w:val="18"/>
-                <w:u w:val="single"/>
-              </w:rPr>
-              <w:t>{{</w:t>
-            </w:r>
-            <w:proofErr w:type="spellStart"/>
-            <w:r>
-              <w:rPr>
-                <w:rFonts w:ascii="Arial" w:hAnsi="Arial" w:cs="Arial"/>
-                <w:i/>
-                <w:sz w:val="18"/>
-                <w:szCs w:val="18"/>
-                <w:u w:val="single"/>
-              </w:rPr>
-              <w:t>rp</w:t>
-            </w:r>
-            <w:proofErr w:type="spellEnd"/>
-            <w:r>
-              <w:rPr>
-                <w:rFonts w:ascii="Arial" w:hAnsi="Arial" w:cs="Arial"/>
-                <w:i/>
-                <w:sz w:val="18"/>
-                <w:szCs w:val="18"/>
-                <w:u w:val="single"/>
-              </w:rPr>
-              <w:t>}}</w:t>
-            </w:r>
-            <w:r>
-              <w:rPr>
-                <w:rFonts w:ascii="Arial" w:hAnsi="Arial" w:cs="Arial"/>
-                <w:sz w:val="18"/>
-                <w:szCs w:val="18"/>
-              </w:rPr>
-              <w:t xml:space="preserve">               </w:t>
-            </w:r>
-            <w:r>
-              <w:rPr>
-                <w:rFonts w:ascii="Arial" w:hAnsi="Arial" w:cs="Arial"/>
-                <w:b/>
-                <w:sz w:val="18"/>
-                <w:szCs w:val="18"/>
-              </w:rPr>
-              <w:t>Código (Rubro Presupuestal):</w:t>
-            </w:r>
-            <w:r>
-              <w:rPr>
-                <w:rFonts w:ascii="Arial" w:hAnsi="Arial" w:cs="Arial"/>
-                <w:sz w:val="18"/>
-                <w:szCs w:val="18"/>
-              </w:rPr>
-              <w:t xml:space="preserve"> {{</w:t>
-            </w:r>
-            <w:proofErr w:type="spellStart"/>
-            <w:r>
-              <w:rPr>
-                <w:rFonts w:ascii="Arial" w:hAnsi="Arial" w:cs="Arial"/>
-                <w:sz w:val="18"/>
-                <w:szCs w:val="18"/>
-              </w:rPr>
-              <w:t>rubro_presupuestal</w:t>
-            </w:r>
-            <w:proofErr w:type="spellEnd"/>
-            <w:r>
-              <w:rPr>
-                <w:rFonts w:ascii="Arial" w:hAnsi="Arial" w:cs="Arial"/>
-                <w:sz w:val="18"/>
-                <w:szCs w:val="18"/>
-              </w:rPr>
-              <w:t>}}</w:t>
-            </w:r>
-          </w:p>
-          <w:p>
-            <w:pPr>
-              <w:rPr>
-                <w:rFonts w:ascii="Arial" w:hAnsi="Arial" w:cs="Arial"/>
-                <w:b/>
-                <w:sz w:val="18"/>
-                <w:szCs w:val="18"/>
-              </w:rPr>
-            </w:pPr>
-          </w:p>
-          <w:p>
-            <w:r>
-              <w:rPr>
-                <w:rFonts w:ascii="Arial" w:hAnsi="Arial" w:cs="Arial"/>
-                <w:b/>
-                <w:sz w:val="18"/>
-                <w:szCs w:val="18"/>
-              </w:rPr>
-              <w:t xml:space="preserve">VALOR TOTAL: </w:t>
-            </w:r>
-            <w:r>
-              <w:rPr>
-                <w:rFonts w:ascii="Arial" w:hAnsi="Arial" w:cs="Arial"/>
-                <w:sz w:val="18"/>
-                <w:szCs w:val="18"/>
-                <w:u w:val="single"/>
-              </w:rPr>
-              <w:t>{{</w:t>
-            </w:r>
-            <w:proofErr w:type="spellStart"/>
-            <w:r>
-              <w:rPr>
-                <w:rFonts w:ascii="Arial" w:hAnsi="Arial" w:cs="Arial"/>
-                <w:sz w:val="18"/>
-                <w:szCs w:val="18"/>
-                <w:u w:val="single"/>
-              </w:rPr>
-              <w:t>valor_total</w:t>
-            </w:r>
-            <w:proofErr w:type="spellEnd"/>
-            <w:r>
-              <w:rPr>
-                <w:rFonts w:ascii="Arial" w:hAnsi="Arial" w:cs="Arial"/>
-                <w:sz w:val="18"/>
-                <w:szCs w:val="18"/>
-                <w:u w:val="single"/>
-              </w:rPr>
-              <w:t>}}</w:t>
-            </w:r>
-            <w:r>
-              <w:rPr>
-                <w:rFonts w:ascii="Arial" w:hAnsi="Arial" w:cs="Arial"/>
-                <w:sz w:val="18"/>
-                <w:szCs w:val="18"/>
-              </w:rPr>
-              <w:t xml:space="preserve"> </w:t>
-            </w:r>
-            <w:r>
-              <w:rPr>
-                <w:rFonts w:ascii="Arial" w:hAnsi="Arial" w:cs="Arial"/>
-                <w:b/>
-                <w:sz w:val="18"/>
-                <w:szCs w:val="18"/>
-              </w:rPr>
-              <w:t xml:space="preserve">                             ENTIDAD BANCARIA:</w:t>
+                <w:b/>
+                <w:sz w:val="18"/>
+                <w:szCs w:val="18"/>
+              </w:rPr>
+              <w:t xml:space="preserve">  </w:t>
+            </w:r>
+            <w:proofErr w:type="gramEnd"/>
+            <w:r>
+              <w:rPr>
+                <w:rFonts w:ascii="Arial" w:hAnsi="Arial" w:cs="Arial"/>
+                <w:b/>
+                <w:sz w:val="18"/>
+                <w:szCs w:val="18"/>
+              </w:rPr>
+              <w:t xml:space="preserve">                           ENTIDAD BANCARIA:</w:t>
             </w:r>
             <w:r>
               <w:rPr>
@@ -1066,6 +1206,7 @@
               <w:t>valor_autorizado_pago</w:t>
             </w:r>
             <w:proofErr w:type="spellEnd"/>
+            <w:proofErr w:type="gramStart"/>
             <w:r>
               <w:rPr>
                 <w:rFonts w:ascii="Arial" w:hAnsi="Arial" w:cs="Arial"/>
@@ -1090,7 +1231,17 @@
                 <w:sz w:val="18"/>
                 <w:szCs w:val="18"/>
               </w:rPr>
-              <w:t xml:space="preserve">          CUENTA No:</w:t>
+              <w:t xml:space="preserve">  </w:t>
+            </w:r>
+            <w:proofErr w:type="gramEnd"/>
+            <w:r>
+              <w:rPr>
+                <w:rFonts w:ascii="Arial" w:hAnsi="Arial" w:cs="Arial"/>
+                <w:b/>
+                <w:sz w:val="18"/>
+                <w:szCs w:val="18"/>
+              </w:rPr>
+              <w:t xml:space="preserve">        CUENTA No:</w:t>
             </w:r>
             <w:r>
               <w:rPr>
@@ -1207,7 +1358,36 @@
                 <w:sz w:val="18"/>
                 <w:szCs w:val="18"/>
               </w:rPr>
-              <w:t xml:space="preserve">                                           FORMA DE PAGO: </w:t>
+              <w:t xml:space="preserve">                                           </w:t>
+            </w:r>
+          </w:p>
+          <w:p>
+            <w:pPr>
+              <w:rPr>
+                <w:rFonts w:ascii="Arial" w:hAnsi="Arial" w:cs="Arial"/>
+                <w:b/>
+                <w:sz w:val="18"/>
+                <w:szCs w:val="18"/>
+              </w:rPr>
+            </w:pPr>
+          </w:p>
+          <w:p>
+            <w:pPr>
+              <w:rPr>
+                <w:rFonts w:ascii="Arial" w:hAnsi="Arial" w:cs="Arial"/>
+                <w:b/>
+                <w:sz w:val="18"/>
+                <w:szCs w:val="18"/>
+              </w:rPr>
+            </w:pPr>
+            <w:r>
+              <w:rPr>
+                <w:rFonts w:ascii="Arial" w:hAnsi="Arial" w:cs="Arial"/>
+                <w:b/>
+                <w:sz w:val="18"/>
+                <w:szCs w:val="18"/>
+              </w:rPr>
+              <w:t xml:space="preserve">FORMA DE PAGO: </w:t>
             </w:r>
             <w:r>
               <w:rPr>
@@ -1298,13 +1478,23 @@
               <w:t>periodo_pagar_inicio</w:t>
             </w:r>
             <w:proofErr w:type="spellEnd"/>
-            <w:r>
-              <w:rPr>
-                <w:rFonts w:ascii="Arial" w:hAnsi="Arial" w:cs="Arial"/>
-                <w:sz w:val="18"/>
-                <w:szCs w:val="18"/>
-              </w:rPr>
-              <w:t>}}  al  {{</w:t>
+            <w:proofErr w:type="gramStart"/>
+            <w:r>
+              <w:rPr>
+                <w:rFonts w:ascii="Arial" w:hAnsi="Arial" w:cs="Arial"/>
+                <w:sz w:val="18"/>
+                <w:szCs w:val="18"/>
+              </w:rPr>
+              <w:t>}}  al</w:t>
+            </w:r>
+            <w:proofErr w:type="gramEnd"/>
+            <w:r>
+              <w:rPr>
+                <w:rFonts w:ascii="Arial" w:hAnsi="Arial" w:cs="Arial"/>
+                <w:sz w:val="18"/>
+                <w:szCs w:val="18"/>
+              </w:rPr>
+              <w:t xml:space="preserve">  {{</w:t>
             </w:r>
             <w:proofErr w:type="spellStart"/>
             <w:r>
@@ -1906,14 +2096,25 @@
               <w:t>valor_salud</w:t>
             </w:r>
             <w:proofErr w:type="spellEnd"/>
-            <w:r>
-              <w:rPr>
-                <w:rFonts w:ascii="Arial" w:hAnsi="Arial" w:cs="Arial"/>
-                <w:sz w:val="18"/>
-                <w:szCs w:val="18"/>
-                <w:lang w:val="es-CO" w:eastAsia="es-CO"/>
-              </w:rPr>
-              <w:t xml:space="preserve">}}                                                               </w:t>
+            <w:proofErr w:type="gramStart"/>
+            <w:r>
+              <w:rPr>
+                <w:rFonts w:ascii="Arial" w:hAnsi="Arial" w:cs="Arial"/>
+                <w:sz w:val="18"/>
+                <w:szCs w:val="18"/>
+                <w:lang w:val="es-CO" w:eastAsia="es-CO"/>
+              </w:rPr>
+              <w:t xml:space="preserve">}}   </w:t>
+            </w:r>
+            <w:proofErr w:type="gramEnd"/>
+            <w:r>
+              <w:rPr>
+                <w:rFonts w:ascii="Arial" w:hAnsi="Arial" w:cs="Arial"/>
+                <w:sz w:val="18"/>
+                <w:szCs w:val="18"/>
+                <w:lang w:val="es-CO" w:eastAsia="es-CO"/>
+              </w:rPr>
+              <w:t xml:space="preserve">                                                            </w:t>
             </w:r>
           </w:p>
         </w:tc>
@@ -2098,7 +2299,25 @@
                 <w:sz w:val="18"/>
                 <w:szCs w:val="18"/>
               </w:rPr>
-              <w:t>Certifico que el contratista cumplió a cabalidad y en el tiempo pactado con las obligaciones contraídas con el Contratante. Por lo tanto autorizo el pago por valor de: $ {{</w:t>
+              <w:t xml:space="preserve">Certifico que el contratista cumplió a cabalidad y en el tiempo pactado con las obligaciones contraídas con el Contratante. Por lo </w:t>
+            </w:r>
+            <w:proofErr w:type="gramStart"/>
+            <w:r>
+              <w:rPr>
+                <w:rFonts w:ascii="Arial" w:hAnsi="Arial" w:cs="Arial"/>
+                <w:sz w:val="18"/>
+                <w:szCs w:val="18"/>
+              </w:rPr>
+              <w:t>tanto</w:t>
+            </w:r>
+            <w:proofErr w:type="gramEnd"/>
+            <w:r>
+              <w:rPr>
+                <w:rFonts w:ascii="Arial" w:hAnsi="Arial" w:cs="Arial"/>
+                <w:sz w:val="18"/>
+                <w:szCs w:val="18"/>
+              </w:rPr>
+              <w:t xml:space="preserve"> autorizo el pago por valor de: $ {{</w:t>
             </w:r>
             <w:proofErr w:type="spellStart"/>
             <w:r>
@@ -2190,13 +2409,23 @@
               <w:t>chk_segundo</w:t>
             </w:r>
             <w:proofErr w:type="spellEnd"/>
-            <w:r>
-              <w:rPr>
-                <w:rFonts w:ascii="Arial" w:hAnsi="Arial" w:cs="Arial"/>
-                <w:sz w:val="18"/>
-                <w:szCs w:val="18"/>
-              </w:rPr>
-              <w:t>}}   TERCERO {{</w:t>
+            <w:proofErr w:type="gramStart"/>
+            <w:r>
+              <w:rPr>
+                <w:rFonts w:ascii="Arial" w:hAnsi="Arial" w:cs="Arial"/>
+                <w:sz w:val="18"/>
+                <w:szCs w:val="18"/>
+              </w:rPr>
+              <w:t xml:space="preserve">}}   </w:t>
+            </w:r>
+            <w:proofErr w:type="gramEnd"/>
+            <w:r>
+              <w:rPr>
+                <w:rFonts w:ascii="Arial" w:hAnsi="Arial" w:cs="Arial"/>
+                <w:sz w:val="18"/>
+                <w:szCs w:val="18"/>
+              </w:rPr>
+              <w:t>TERCERO {{</w:t>
             </w:r>
             <w:proofErr w:type="spellStart"/>
             <w:r>

</xml_diff>